<commit_message>
Update snapshot to 180 of 230 Yoco HTML scenarios
Ultraworked with [Sisyphus](https://github.com/code-yeongyu/oh-my-openagent)

Co-authored-by: Sisyphus <clio-agent@sisyphuslabs.ai>
</commit_message>
<xml_diff>
--- a/api_coverage_snapshot.docx
+++ b/api_coverage_snapshot.docx
@@ -76,7 +76,7 @@
           <w:sz w:val="20"/>
           <w:szCs w:val="20"/>
         </w:rPr>
-        <w:t>133 distinct endpoints across four APIs, with 131 covered. Yoco was run twice to compare input formats, producing 844 tests across 5 input runs. This run demonstrated four input formats: OpenAPI, Swagger, Postman, and HTML documentation. The same approach extends to other documentation formats and source types.</w:t>
+        <w:t>133 distinct endpoints across four APIs, with 131 covered. Yoco was run twice to compare input formats, producing 753 tests across 5 input runs. This run demonstrated four input formats: OpenAPI, Swagger, Postman, and HTML documentation. The same approach extends to other documentation formats and source types.</w:t>
       </w:r>
       <w:r>
         <w:rPr>
@@ -878,7 +878,7 @@
           </w:tcPr>
           <w:p>
             <w:r>
-              <w:t>230/230 (100%)</w:t>
+              <w:t>180/230 (78.3%)</w:t>
             </w:r>
           </w:p>
         </w:tc>
@@ -901,7 +901,7 @@
           </w:tcPr>
           <w:p>
             <w:r>
-              <w:t>284</w:t>
+              <w:t>193</w:t>
             </w:r>
           </w:p>
         </w:tc>
@@ -1838,7 +1838,7 @@
           </w:tcPr>
           <w:p>
             <w:r>
-              <w:t>284</w:t>
+              <w:t>193</w:t>
             </w:r>
           </w:p>
         </w:tc>

</xml_diff>

<commit_message>
Clarify Yoco HTML versus OpenAPI comparison
Ultraworked with [Sisyphus](https://github.com/code-yeongyu/oh-my-openagent)

Co-authored-by: Sisyphus <clio-agent@sisyphuslabs.ai>
</commit_message>
<xml_diff>
--- a/api_coverage_snapshot.docx
+++ b/api_coverage_snapshot.docx
@@ -1864,28 +1864,26 @@
           <w:sz w:val="20"/>
           <w:szCs w:val="20"/>
         </w:rPr>
-        <w:t xml:space="preserve">This comparison shows that output depth depends on the completeness of the source material provided. In this Yoco sample, the HTML documentation covered a broader surface area than the supplied OpenAPI file, so it yielded more endpoints and response scenarios.</w:t>
-      </w:r>
-      <w:r>
-        <w:rPr>
-          <w:rFonts w:ascii="Calibri" w:cs="Calibri" w:eastAsia="Calibri" w:hAnsi="Calibri"/>
-          <w:sz w:val="20"/>
-          <w:szCs w:val="20"/>
-        </w:rPr>
-        <w:t xml:space="preserve"> </w:t>
-      </w:r>
-      <w:r>
-        <w:rPr>
-          <w:rFonts w:ascii="Calibri" w:cs="Calibri" w:eastAsia="Calibri" w:hAnsi="Calibri"/>
-          <w:b w:val="false"/>
-          <w:bCs w:val="false"/>
-          <w:i w:val="false"/>
-          <w:iCs w:val="false"/>
-          <w:color w:val="1A1A1A"/>
-          <w:sz w:val="20"/>
-          <w:szCs w:val="20"/>
-        </w:rPr>
-        <w:t xml:space="preserve">Bottom line: both formats produce strong, usable output. The operational advantage of OpenAPI is its consistency, structure, and suitability for automation; raw HTML documentation remains a viable input when that is the source material available.</w:t>
+        <w:t>This comparison shows that output depth depends on the completeness of the source material provided. In this Yoco sample, the HTML documentation covered a broader surface area than the supplied OpenAPI file, so it yielded more endpoints and response scenarios. HTML test count is lower because only independently verifiable scenarios are retained (180/230), while OpenAPI retains 205/206.</w:t>
+      </w:r>
+      <w:r>
+        <w:rPr>
+          <w:rFonts w:ascii="Calibri" w:cs="Calibri" w:eastAsia="Calibri" w:hAnsi="Calibri"/>
+          <w:sz w:val="20"/>
+          <w:szCs w:val="20"/>
+        </w:rPr>
+      </w:r>
+      <w:r>
+        <w:rPr>
+          <w:rFonts w:ascii="Calibri" w:cs="Calibri" w:eastAsia="Calibri" w:hAnsi="Calibri"/>
+          <w:b w:val="false"/>
+          <w:bCs w:val="false"/>
+          <w:i w:val="false"/>
+          <w:iCs w:val="false"/>
+          <w:color w:val="1A1A1A"/>
+          <w:sz w:val="20"/>
+          <w:szCs w:val="20"/>
+        </w:rPr>
       </w:r>
     </w:p>
     <w:p>

</xml_diff>